<commit_message>
Manuscript: cite the authors' Scientific Reports caesarean section paper in the case study and discussion
Co-Authored-By: Claude Opus 5.5 <noreply@anthropic.com>
</commit_message>
<xml_diff>
--- a/paper/submission/Manuscript.docx
+++ b/paper/submission/Manuscript.docx
@@ -8583,6 +8583,52 @@
         <w:pStyle w:val="FirstParagraph"/>
       </w:pPr>
       <w:r>
+        <w:t xml:space="preserve">We previously examined the determinants of caesarean section in Bangladesh</w:t>
+      </w:r>
+      <w:r>
+        <w:t xml:space="preserve"> </w:t>
+      </w:r>
+      <w:r>
+        <w:t xml:space="preserve">over the same period with survey-weighted logistic regression</w:t>
+      </w:r>
+      <w:r>
+        <w:t xml:space="preserve"> </w:t>
+      </w:r>
+      <w:r>
+        <w:t xml:space="preserve">[</w:t>
+      </w:r>
+      <w:hyperlink w:anchor="_78cc7d9af08ce43be0249b471fc82c54e734aed">
+        <w:r>
+          <w:rPr>
+            <w:rStyle w:val="Hyperlink"/>
+          </w:rPr>
+          <w:t xml:space="preserve">20</w:t>
+        </w:r>
+      </w:hyperlink>
+      <w:r>
+        <w:t xml:space="preserve">]</w:t>
+      </w:r>
+      <w:r>
+        <w:t xml:space="preserve">.</w:t>
+      </w:r>
+      <w:r>
+        <w:t xml:space="preserve"> </w:t>
+      </w:r>
+      <w:r>
+        <w:t xml:space="preserve">Here the same trend is used to illustrate the package’s descriptive tools:</w:t>
+      </w:r>
+      <w:r>
+        <w:t xml:space="preserve"> </w:t>
+      </w:r>
+      <w:r>
+        <w:t xml:space="preserve">change between rounds, wealth-related inequality and decomposition.</w:t>
+      </w:r>
+    </w:p>
+    <w:p>
+      <w:pPr>
+        <w:pStyle w:val="BodyText"/>
+      </w:pPr>
+      <w:r>
         <w:t xml:space="preserve">The share of births delivered by caesarean section rose from 4.5% in 2004 to</w:t>
       </w:r>
       <w:r>
@@ -11927,6 +11973,68 @@
           <w:rPr>
             <w:rStyle w:val="Hyperlink"/>
           </w:rPr>
+          <w:t xml:space="preserve">21</w:t>
+        </w:r>
+      </w:hyperlink>
+      <w:r>
+        <w:t xml:space="preserve">]</w:t>
+      </w:r>
+      <w:r>
+        <w:t xml:space="preserve">. As its use spread beyond the richest</w:t>
+      </w:r>
+      <w:r>
+        <w:t xml:space="preserve"> </w:t>
+      </w:r>
+      <w:r>
+        <w:t xml:space="preserve">households, absolute inequality widened while relative inequality fell.</w:t>
+      </w:r>
+      <w:r>
+        <w:t xml:space="preserve"> </w:t>
+      </w:r>
+      <w:r>
+        <w:t xml:space="preserve">Changes in maternal education and household wealth explain only a small part</w:t>
+      </w:r>
+      <w:r>
+        <w:t xml:space="preserve"> </w:t>
+      </w:r>
+      <w:r>
+        <w:t xml:space="preserve">of the rise which occurred within every group. That pattern points to</w:t>
+      </w:r>
+      <w:r>
+        <w:t xml:space="preserve"> </w:t>
+      </w:r>
+      <w:r>
+        <w:t xml:space="preserve">changes in health-system practice rather than in the characteristics of the</w:t>
+      </w:r>
+      <w:r>
+        <w:t xml:space="preserve"> </w:t>
+      </w:r>
+      <w:r>
+        <w:t xml:space="preserve">mothers, and is consistent with our earlier finding that caesarean delivery</w:t>
+      </w:r>
+      <w:r>
+        <w:t xml:space="preserve"> </w:t>
+      </w:r>
+      <w:r>
+        <w:t xml:space="preserve">has spread through the private sector and become less tied to medical</w:t>
+      </w:r>
+      <w:r>
+        <w:t xml:space="preserve"> </w:t>
+      </w:r>
+      <w:r>
+        <w:t xml:space="preserve">indications</w:t>
+      </w:r>
+      <w:r>
+        <w:t xml:space="preserve"> </w:t>
+      </w:r>
+      <w:r>
+        <w:t xml:space="preserve">[</w:t>
+      </w:r>
+      <w:hyperlink w:anchor="_78cc7d9af08ce43be0249b471fc82c54e734aed">
+        <w:r>
+          <w:rPr>
+            <w:rStyle w:val="Hyperlink"/>
+          </w:rPr>
           <w:t xml:space="preserve">20</w:t>
         </w:r>
       </w:hyperlink>
@@ -11934,43 +12042,19 @@
         <w:t xml:space="preserve">]</w:t>
       </w:r>
       <w:r>
-        <w:t xml:space="preserve">. As its use spread beyond the richest</w:t>
-      </w:r>
-      <w:r>
-        <w:t xml:space="preserve"> </w:t>
-      </w:r>
-      <w:r>
-        <w:t xml:space="preserve">households, absolute inequality widened while relative inequality fell.</w:t>
-      </w:r>
-      <w:r>
-        <w:t xml:space="preserve"> </w:t>
-      </w:r>
-      <w:r>
-        <w:t xml:space="preserve">Changes in maternal education and household wealth explain only a small part</w:t>
-      </w:r>
-      <w:r>
-        <w:t xml:space="preserve"> </w:t>
-      </w:r>
-      <w:r>
-        <w:t xml:space="preserve">of the rise which occurred within every group. That pattern points to</w:t>
-      </w:r>
-      <w:r>
-        <w:t xml:space="preserve"> </w:t>
-      </w:r>
-      <w:r>
-        <w:t xml:space="preserve">changes in health-system practice rather than in the characteristics of the</w:t>
-      </w:r>
-      <w:r>
-        <w:t xml:space="preserve"> </w:t>
-      </w:r>
-      <w:r>
-        <w:t xml:space="preserve">mothers. Separating these components with proper standard errors is</w:t>
-      </w:r>
-      <w:r>
-        <w:t xml:space="preserve"> </w:t>
-      </w:r>
-      <w:r>
-        <w:t xml:space="preserve">straightforward once the design and indicator definitions are right.</w:t>
+        <w:t xml:space="preserve">. Separating these components with proper standard</w:t>
+      </w:r>
+      <w:r>
+        <w:t xml:space="preserve"> </w:t>
+      </w:r>
+      <w:r>
+        <w:t xml:space="preserve">errors is straightforward once the design and indicator definitions are</w:t>
+      </w:r>
+      <w:r>
+        <w:t xml:space="preserve"> </w:t>
+      </w:r>
+      <w:r>
+        <w:t xml:space="preserve">right.</w:t>
       </w:r>
     </w:p>
     <w:p>
@@ -12659,7 +12743,7 @@
       </w:r>
       <w:bookmarkEnd w:id="43"/>
     </w:p>
-    <w:bookmarkStart w:id="69" w:name="_refs"/>
+    <w:bookmarkStart w:id="71" w:name="_refs"/>
     <w:bookmarkStart w:id="44" w:name="_891bd0618677fbaff9555cad9408ba6779b4c16"/>
     <w:p>
       <w:pPr>
@@ -13019,17 +13103,53 @@
       </w:r>
     </w:p>
     <w:bookmarkEnd w:id="67"/>
-    <w:bookmarkStart w:id="68" w:name="_658ee18b5604f80a7fe4bfbdc797395d3f6bbde"/>
+    <w:bookmarkStart w:id="69" w:name="_78cc7d9af08ce43be0249b471fc82c54e734aed"/>
     <w:p>
       <w:pPr>
         <w:pStyle w:val="Bibliography"/>
       </w:pPr>
       <w:r>
-        <w:t xml:space="preserve">20. Betrán AP, Ye J, Moller A-B, Zhang J, Gülmezoglu AM, Torloni MR. The increasing trend in caesarean section rates: Global, regional and national estimates: 1990-2014. PLoS ONE. 2016;11:e0148343.</w:t>
-      </w:r>
-    </w:p>
-    <w:bookmarkEnd w:id="68"/>
+        <w:t xml:space="preserve">20. Rony AR, Hossen A, Asha AS, Nahin KSA. From medical necessity to private-sector dominance: A two-decade evolution of caesarean section determinants in</w:t>
+      </w:r>
+      <w:r>
+        <w:t xml:space="preserve"> </w:t>
+      </w:r>
+      <w:r>
+        <w:t xml:space="preserve">Bangladesh</w:t>
+      </w:r>
+      <w:r>
+        <w:t xml:space="preserve"> </w:t>
+      </w:r>
+      <w:r>
+        <w:t xml:space="preserve">(2004–2022). Scientific Reports. 2026;16:21320.</w:t>
+      </w:r>
+      <w:r>
+        <w:t xml:space="preserve"> </w:t>
+      </w:r>
+      <w:hyperlink r:id="rId68">
+        <w:r>
+          <w:rPr>
+            <w:rStyle w:val="Hyperlink"/>
+          </w:rPr>
+          <w:t xml:space="preserve">https://doi.org/10.1038/s41598-026-52229-9</w:t>
+        </w:r>
+      </w:hyperlink>
+      <w:r>
+        <w:t xml:space="preserve">.</w:t>
+      </w:r>
+    </w:p>
     <w:bookmarkEnd w:id="69"/>
+    <w:bookmarkStart w:id="70" w:name="_658ee18b5604f80a7fe4bfbdc797395d3f6bbde"/>
+    <w:p>
+      <w:pPr>
+        <w:pStyle w:val="Bibliography"/>
+      </w:pPr>
+      <w:r>
+        <w:t xml:space="preserve">21. Betrán AP, Ye J, Moller A-B, Zhang J, Gülmezoglu AM, Torloni MR. The increasing trend in caesarean section rates: Global, regional and national estimates: 1990-2014. PLoS ONE. 2016;11:e0148343.</w:t>
+      </w:r>
+    </w:p>
+    <w:bookmarkEnd w:id="70"/>
+    <w:bookmarkEnd w:id="71"/>
     <w:sectPr>
       <w:footnotePr>
         <w:numRestart w:val="eachSect"/>

</xml_diff>